<commit_message>
annual exam, child dev completed
</commit_message>
<xml_diff>
--- a/child dev/Cover page NURSERY.docx
+++ b/child dev/Cover page NURSERY.docx
@@ -72,7 +72,7 @@
           </mc:Choice>
           <mc:Fallback>
             <w:pict>
-              <v:rect w14:anchorId="6DE52D4C" id="Rectangle 1" o:spid="_x0000_s1026" style="position:absolute;margin-left:-5.45pt;margin-top:-4.5pt;width:370.5pt;height:515.25pt;z-index:251664384;visibility:visible;mso-wrap-style:square;mso-width-percent:0;mso-height-percent:0;mso-wrap-distance-left:9pt;mso-wrap-distance-top:0;mso-wrap-distance-right:9pt;mso-wrap-distance-bottom:0;mso-position-horizontal:absolute;mso-position-horizontal-relative:text;mso-position-vertical:absolute;mso-position-vertical-relative:text;mso-width-percent:0;mso-height-percent:0;mso-width-relative:margin;mso-height-relative:margin;v-text-anchor:middle" o:gfxdata="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" filled="f" strokecolor="windowText" strokeweight="2pt"/>
+              <v:rect w14:anchorId="50AE7853" id="Rectangle 1" o:spid="_x0000_s1026" style="position:absolute;margin-left:-5.45pt;margin-top:-4.5pt;width:370.5pt;height:515.25pt;z-index:251664384;visibility:visible;mso-wrap-style:square;mso-width-percent:0;mso-height-percent:0;mso-wrap-distance-left:9pt;mso-wrap-distance-top:0;mso-wrap-distance-right:9pt;mso-wrap-distance-bottom:0;mso-position-horizontal:absolute;mso-position-horizontal-relative:text;mso-position-vertical:absolute;mso-position-vertical-relative:text;mso-width-percent:0;mso-height-percent:0;mso-width-relative:margin;mso-height-relative:margin;v-text-anchor:middle" o:gfxdata="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" filled="f" strokecolor="windowText" strokeweight="2pt"/>
             </w:pict>
           </mc:Fallback>
         </mc:AlternateContent>
@@ -548,7 +548,7 @@
           </mc:Choice>
           <mc:Fallback>
             <w:pict>
-              <v:rect w14:anchorId="7D101E72" id="Rectangle 2" o:spid="_x0000_s1026" style="position:absolute;margin-left:-5.25pt;margin-top:11.05pt;width:370.5pt;height:260.25pt;z-index:251665408;visibility:visible;mso-wrap-style:square;mso-width-percent:0;mso-height-percent:0;mso-wrap-distance-left:9pt;mso-wrap-distance-top:0;mso-wrap-distance-right:9pt;mso-wrap-distance-bottom:0;mso-position-horizontal:absolute;mso-position-horizontal-relative:text;mso-position-vertical:absolute;mso-position-vertical-relative:text;mso-width-percent:0;mso-height-percent:0;mso-width-relative:margin;mso-height-relative:margin;v-text-anchor:middle" o:gfxdata="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" filled="f" strokecolor="windowText" strokeweight=".25pt"/>
+              <v:rect w14:anchorId="3C4C772B" id="Rectangle 2" o:spid="_x0000_s1026" style="position:absolute;margin-left:-5.25pt;margin-top:11.05pt;width:370.5pt;height:260.25pt;z-index:251665408;visibility:visible;mso-wrap-style:square;mso-width-percent:0;mso-height-percent:0;mso-wrap-distance-left:9pt;mso-wrap-distance-top:0;mso-wrap-distance-right:9pt;mso-wrap-distance-bottom:0;mso-position-horizontal:absolute;mso-position-horizontal-relative:text;mso-position-vertical:absolute;mso-position-vertical-relative:text;mso-width-percent:0;mso-height-percent:0;mso-width-relative:margin;mso-height-relative:margin;v-text-anchor:middle" o:gfxdata="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" filled="f" strokecolor="windowText" strokeweight=".25pt"/>
             </w:pict>
           </mc:Fallback>
         </mc:AlternateContent>
@@ -941,7 +941,7 @@
           </mc:Choice>
           <mc:Fallback>
             <w:pict>
-              <v:rect w14:anchorId="52E03150" id="Rectangle 3" o:spid="_x0000_s1026" style="position:absolute;margin-left:.75pt;margin-top:-4.5pt;width:366pt;height:515.25pt;z-index:251661312;visibility:visible;mso-wrap-style:square;mso-height-percent:0;mso-wrap-distance-left:9pt;mso-wrap-distance-top:0;mso-wrap-distance-right:9pt;mso-wrap-distance-bottom:0;mso-position-horizontal:absolute;mso-position-horizontal-relative:text;mso-position-vertical:absolute;mso-position-vertical-relative:text;mso-height-percent:0;mso-height-relative:margin;v-text-anchor:middle" o:gfxdata="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" filled="f" strokecolor="black [3213]" strokeweight="2pt"/>
+              <v:rect w14:anchorId="1FDC9512" id="Rectangle 3" o:spid="_x0000_s1026" style="position:absolute;margin-left:.75pt;margin-top:-4.5pt;width:366pt;height:515.25pt;z-index:251661312;visibility:visible;mso-wrap-style:square;mso-height-percent:0;mso-wrap-distance-left:9pt;mso-wrap-distance-top:0;mso-wrap-distance-right:9pt;mso-wrap-distance-bottom:0;mso-position-horizontal:absolute;mso-position-horizontal-relative:text;mso-position-vertical:absolute;mso-position-vertical-relative:text;mso-height-percent:0;mso-height-relative:margin;v-text-anchor:middle" o:gfxdata="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" filled="f" strokecolor="black [3213]" strokeweight="2pt"/>
             </w:pict>
           </mc:Fallback>
         </mc:AlternateContent>
@@ -1455,20 +1455,7 @@
                                   <w14:bevel/>
                                 </w14:textOutline>
                               </w:rPr>
-                              <w:t>D</w:t>
-                            </w:r>
-                            <w:r>
-                              <w:rPr>
-                                <w:color w:val="000000" w:themeColor="text1"/>
-                                <w14:textOutline w14:w="9525" w14:cap="rnd" w14:cmpd="sng" w14:algn="ctr">
-                                  <w14:solidFill>
-                                    <w14:srgbClr w14:val="000000"/>
-                                  </w14:solidFill>
-                                  <w14:prstDash w14:val="solid"/>
-                                  <w14:bevel/>
-                                </w14:textOutline>
-                              </w:rPr>
-                              <w:t>anfe</w:t>
+                              <w:t>Danfe</w:t>
                             </w:r>
                             <w:r>
                               <w:rPr>
@@ -1931,20 +1918,7 @@
                             <w14:bevel/>
                           </w14:textOutline>
                         </w:rPr>
-                        <w:t>D</w:t>
-                      </w:r>
-                      <w:r>
-                        <w:rPr>
-                          <w:color w:val="000000" w:themeColor="text1"/>
-                          <w14:textOutline w14:w="9525" w14:cap="rnd" w14:cmpd="sng" w14:algn="ctr">
-                            <w14:solidFill>
-                              <w14:srgbClr w14:val="000000"/>
-                            </w14:solidFill>
-                            <w14:prstDash w14:val="solid"/>
-                            <w14:bevel/>
-                          </w14:textOutline>
-                        </w:rPr>
-                        <w:t>anfe</w:t>
+                        <w:t>Danfe</w:t>
                       </w:r>
                       <w:r>
                         <w:rPr>
@@ -2763,6 +2737,7 @@
   <w:style w:type="character" w:default="1" w:styleId="DefaultParagraphFont">
     <w:name w:val="Default Paragraph Font"/>
     <w:uiPriority w:val="1"/>
+    <w:semiHidden/>
     <w:unhideWhenUsed/>
   </w:style>
   <w:style w:type="table" w:default="1" w:styleId="TableNormal">

</xml_diff>